<commit_message>
Ajustar Planteamiento a 6 páginas y referencias en página aparte
- El planteamiento del problema ocupa ~6 páginas (Times New Roman 12, interlineado
  1.5, justificado, márgenes 2.54 cm) con los 3 gráficos oficiales.
- Salto de página antes de "Referencias" para que queden en hoja aparte.
- Ligeros ajustes de redacción y de tamaño de figuras para encuadrar a 6 páginas.

Co-Authored-By: Claude Opus 4.8 <noreply@anthropic.com>
Claude-Session: https://claude.ai/code/session_01T59R29kr8KHfoMXx4GYgMx
</commit_message>
<xml_diff>
--- a/planteamiento-informalidad-lima/1.1_Planteamiento_del_Problema_6pag_graficos_oficiales.docx
+++ b/planteamiento-informalidad-lima/1.1_Planteamiento_del_Problema_6pag_graficos_oficiales.docx
@@ -63,7 +63,7 @@
       <w:r>
         <w:drawing>
           <wp:inline xmlns:a="http://schemas.openxmlformats.org/drawingml/2006/main" xmlns:pic="http://schemas.openxmlformats.org/drawingml/2006/picture">
-            <wp:extent cx="4206240" cy="3980719"/>
+            <wp:extent cx="3657600" cy="3461495"/>
             <wp:docPr id="1" name="Picture 1"/>
             <wp:cNvGraphicFramePr>
               <a:graphicFrameLocks noChangeAspect="1"/>
@@ -84,7 +84,7 @@
                   <pic:spPr>
                     <a:xfrm>
                       <a:off x="0" y="0"/>
-                      <a:ext cx="4206240" cy="3980719"/>
+                      <a:ext cx="3657600" cy="3461495"/>
                     </a:xfrm>
                     <a:prstGeom prst="rect"/>
                   </pic:spPr>
@@ -176,7 +176,7 @@
       <w:r>
         <w:drawing>
           <wp:inline xmlns:a="http://schemas.openxmlformats.org/drawingml/2006/main" xmlns:pic="http://schemas.openxmlformats.org/drawingml/2006/picture">
-            <wp:extent cx="5120640" cy="2975886"/>
+            <wp:extent cx="4754880" cy="2763322"/>
             <wp:docPr id="2" name="Picture 2"/>
             <wp:cNvGraphicFramePr>
               <a:graphicFrameLocks noChangeAspect="1"/>
@@ -197,7 +197,7 @@
                   <pic:spPr>
                     <a:xfrm>
                       <a:off x="0" y="0"/>
-                      <a:ext cx="5120640" cy="2975886"/>
+                      <a:ext cx="4754880" cy="2763322"/>
                     </a:xfrm>
                     <a:prstGeom prst="rect"/>
                   </pic:spPr>
@@ -239,7 +239,7 @@
         <w:rPr>
           <w:rFonts w:ascii="Times New Roman" w:hAnsi="Times New Roman" w:cs="Times New Roman"/>
         </w:rPr>
-        <w:t>En América Latina y el Caribe, la informalidad es un rasgo estructural del mercado de trabajo y un determinante central de la desigualdad. Hacia 2024, alrededor del 47,6 % de la población ocupada de la región se encontraba en empleo informal (OIT, 2024b); sin embargo, la mayor parte de los nuevos empleos creados en el último ciclo han sido informales y se concentran en los hogares de menores ingresos, perpetuando trampas de pobreza y vulnerabilidad (Comisión Económica para América Latina y el Caribe [CEPAL], 2023). La evidencia regional muestra de manera consistente que la probabilidad de ser informal aumenta con el menor nivel educativo, en las mujeres —en especial cuando existen dependientes en el hogar—, en los jóvenes y los adultos mayores, en las zonas rurales y entre los trabajadores de microempresas (CEPAL, 2023). Dentro de este panorama, el Perú figura sistemáticamente entre los países con mayores tasas de informalidad de la región, lo que confiere especial relevancia al análisis de sus determinantes.</w:t>
+        <w:t>En América Latina y el Caribe, la informalidad es un rasgo estructural del mercado de trabajo y un determinante central de la desigualdad. Hacia 2024, alrededor del 47,6 % de la población ocupada de la región se encontraba en empleo informal (OIT, 2024b); sin embargo, la mayor parte de los nuevos empleos creados en el último ciclo han sido informales y se concentran en los hogares de menores ingresos, perpetuando trampas de pobreza y vulnerabilidad (Comisión Económica para América Latina y el Caribe [CEPAL], 2023). La evidencia regional muestra de manera consistente que la probabilidad de ser informal aumenta con el menor nivel educativo, en las mujeres, en los jóvenes y los adultos mayores, en las zonas rurales y entre los trabajadores de microempresas (CEPAL, 2023). Dentro de este panorama, el Perú figura sistemáticamente entre los países con mayores tasas de informalidad de la región, lo que confiere especial relevancia al análisis de sus determinantes.</w:t>
       </w:r>
     </w:p>
     <w:p>
@@ -289,7 +289,7 @@
       <w:r>
         <w:drawing>
           <wp:inline xmlns:a="http://schemas.openxmlformats.org/drawingml/2006/main" xmlns:pic="http://schemas.openxmlformats.org/drawingml/2006/picture">
-            <wp:extent cx="4389120" cy="3190175"/>
+            <wp:extent cx="3931920" cy="2857865"/>
             <wp:docPr id="3" name="Picture 3"/>
             <wp:cNvGraphicFramePr>
               <a:graphicFrameLocks noChangeAspect="1"/>
@@ -310,7 +310,7 @@
                   <pic:spPr>
                     <a:xfrm>
                       <a:off x="0" y="0"/>
-                      <a:ext cx="4389120" cy="3190175"/>
+                      <a:ext cx="3931920" cy="2857865"/>
                     </a:xfrm>
                     <a:prstGeom prst="rect"/>
                   </pic:spPr>
@@ -365,7 +365,7 @@
         <w:rPr>
           <w:rFonts w:ascii="Times New Roman" w:hAnsi="Times New Roman" w:cs="Times New Roman"/>
         </w:rPr>
-        <w:t>Las consecuencias de la informalidad se proyectan tanto sobre los trabajadores como sobre el conjunto de la economía. En el plano individual, los trabajadores informales carecen de protección social, enfrentan mayor inestabilidad de ingresos y disponen de escasas oportunidades de capacitación y de acceso al crédito formal. En el plano agregado, la informalidad erosiona la base tributaria del Estado y deprime la productividad media, pues las unidades informales permanecen pequeñas y descapitalizadas (Loayza, 2008; Ulyssea, 2020). La comparación internacional es ilustrativa: en economías de mayor formalidad, como Chile, la productividad por trabajador casi duplica la peruana, en parte porque la formalidad facilita el acceso a financiamiento, tecnología y capacitación. Ante la falta de empleo formal, amplios segmentos de la población económicamente activa recurren a ocupaciones eventuales de subsistencia —los denominados «cachuelos»—, que rara vez ofrecen estabilidad ni posibilidades de desarrollo profesional.</w:t>
+        <w:t>Las consecuencias de la informalidad se proyectan tanto sobre los trabajadores como sobre el conjunto de la economía. En el plano individual, los trabajadores informales carecen de protección social, enfrentan mayor inestabilidad de ingresos y disponen de escaso acceso a la capacitación y al crédito formal. En el plano agregado, la informalidad erosiona la base tributaria del Estado y deprime la productividad media, pues las unidades informales permanecen pequeñas y descapitalizadas; la evidencia comparada muestra que en economías más formales, como Chile, la productividad por trabajador casi duplica la peruana (Loayza, 2008; Ulyssea, 2020). Ante la falta de empleo formal, amplios segmentos de la PEA recurren a ocupaciones eventuales de subsistencia —los «cachuelos»—, que rara vez ofrecen estabilidad ni desarrollo profesional.</w:t>
       </w:r>
     </w:p>
     <w:p>
@@ -495,7 +495,7 @@
         <w:rPr>
           <w:rFonts w:ascii="Times New Roman" w:hAnsi="Times New Roman" w:cs="Times New Roman"/>
         </w:rPr>
-        <w:t xml:space="preserve"> del país, dado que concentra la mayor parte de la población ocupada nacional. A ello se suma que, según el INEI (2025), Lima y Callao figuraron entre las ciudades donde la informalidad aumentó respecto de 2023, lo que sugiere un posible estancamiento del proceso de formalización en la capital. Además, el departamento comprende tanto la metrópoli moderna como provincias de carácter rural y agrario, donde la informalidad es mucho mayor, de modo que el promedio departamental enmascara realidades laborales profundamente desiguales.</w:t>
+        <w:t xml:space="preserve"> del país, dado que concentra la mayor parte de la población ocupada nacional. A ello se suma que, según el INEI (2025), Lima y Callao figuraron entre las ciudades donde la informalidad aumentó respecto de 2023. Además, el departamento comprende tanto la metrópoli moderna como provincias de carácter rural, donde la informalidad es mucho mayor, de modo que el promedio departamental enmascara realidades laborales profundamente desiguales.</w:t>
       </w:r>
     </w:p>
     <w:p>
@@ -574,6 +574,11 @@
           <w:rFonts w:ascii="Times New Roman" w:hAnsi="Times New Roman" w:cs="Times New Roman"/>
         </w:rPr>
         <w:t xml:space="preserve"> obedece a razones científicas y de oportunidad: Lima es el mercado laboral más grande y diverso, donde la informalidad no puede atribuirse principalmente a la ruralidad sino a factores socioeconómicos individuales; el periodo corresponde a la fase de normalización pospandemia, en la que la informalidad se mantiene elevada e incluso repuntó en la capital; y, por primera vez de manera consolidada, se dispone de la información de la Encuesta Permanente de Empleo Nacional, que permite un análisis más preciso y actualizado. En síntesis, la informalidad laboral es un fenómeno estructural, global y persistente que en el departamento de Lima —pese a presentar las tasas relativas más bajas del país— afecta a la mayoría de los trabajadores y al mayor volumen absoluto de población ocupada del territorio nacional, asociado de manera robusta al nivel de ingresos, el nivel educativo y las características demográficas. Comprender la magnitud y la dirección del efecto de estos factores en el contexto limeño de 2024-2025 resulta indispensable para orientar políticas públicas eficaces, lo que conduce a la formulación del problema de investigación.</w:t>
+      </w:r>
+    </w:p>
+    <w:p>
+      <w:r>
+        <w:br w:type="page"/>
       </w:r>
     </w:p>
     <w:p>

</xml_diff>

<commit_message>
Usar tamaño A4 y completar el Planteamiento a 6 páginas
- Página A4 (21 x 29,7 cm), márgenes 2.54 cm, Times New Roman 12, interlineado 1.5,
  texto justificado (estándar de tesis UNMSM).
- Párrafos adicionales (estado civil como variable, estancamiento de la
  formalización en Lima, uso de modelos logit/probit con microdatos de la EPEN)
  para encuadrar el planteamiento en ~6 páginas.
- Referencias en página aparte (salto de página).

Co-Authored-By: Claude Opus 4.8 <noreply@anthropic.com>
Claude-Session: https://claude.ai/code/session_01T59R29kr8KHfoMXx4GYgMx
</commit_message>
<xml_diff>
--- a/planteamiento-informalidad-lima/1.1_Planteamiento_del_Problema_6pag_graficos_oficiales.docx
+++ b/planteamiento-informalidad-lima/1.1_Planteamiento_del_Problema_6pag_graficos_oficiales.docx
@@ -456,7 +456,7 @@
         <w:rPr>
           <w:rFonts w:ascii="Times New Roman" w:hAnsi="Times New Roman" w:cs="Times New Roman"/>
         </w:rPr>
-        <w:t>. La edad mantiene una relación no lineal con la informalidad —máxima entre los jóvenes de 14 a 24 años (85,4 %), mínima en las edades centrales y nuevamente creciente entre los adultos mayores—; las mujeres registran tasas superiores a las de los hombres (73,1 % frente a 68,8 %), por la segregación ocupacional y la carga del trabajo de cuidado; y la informalidad es muy superior en el ámbito rural (94,6 %) respecto del urbano (65,1 %) (INEI, 2025; CEPAL, 2023). Estos hallazgos sustentan la inclusión del nivel de ingresos, el nivel educativo y los determinantes demográficos —edad, sexo y estado civil— como variables explicativas centrales del presente estudio.</w:t>
+        <w:t>. La edad mantiene una relación no lineal con la informalidad —máxima entre los jóvenes de 14 a 24 años (85,4 %), mínima en las edades centrales y nuevamente creciente entre los adultos mayores—; las mujeres registran tasas superiores a las de los hombres (73,1 % frente a 68,8 %), por la segregación ocupacional y la carga del trabajo de cuidado; y la informalidad es muy superior en el ámbito rural (94,6 %) respecto del urbano (65,1 %) (INEI, 2025; CEPAL, 2023). El estado civil, por su parte, también incide en la decisión de informalidad: la literatura reporta que las personas con pareja o con responsabilidades de jefatura del hogar presentan patrones de inserción laboral diferenciados, asociados a una mayor necesidad de estabilidad de ingresos, por lo que constituye un control demográfico pertinente. Estos hallazgos sustentan la inclusión del nivel de ingresos, el nivel educativo y los determinantes demográficos —edad, sexo y estado civil— como variables explicativas centrales del presente estudio.</w:t>
       </w:r>
     </w:p>
     <w:p>
@@ -495,7 +495,7 @@
         <w:rPr>
           <w:rFonts w:ascii="Times New Roman" w:hAnsi="Times New Roman" w:cs="Times New Roman"/>
         </w:rPr>
-        <w:t xml:space="preserve"> del país, dado que concentra la mayor parte de la población ocupada nacional. A ello se suma que, según el INEI (2025), Lima y Callao figuraron entre las ciudades donde la informalidad aumentó respecto de 2023. Además, el departamento comprende tanto la metrópoli moderna como provincias de carácter rural, donde la informalidad es mucho mayor, de modo que el promedio departamental enmascara realidades laborales profundamente desiguales.</w:t>
+        <w:t xml:space="preserve"> del país, dado que concentra la mayor parte de la población ocupada nacional. A ello se suma que, según el INEI (2025), Lima y Callao figuraron entre las ciudades donde la informalidad aumentó respecto de 2023, lo que sugiere un posible estancamiento del proceso de formalización en la capital. Además, el departamento comprende tanto la metrópoli moderna como provincias de carácter rural, donde la informalidad es mucho mayor, de modo que el promedio departamental enmascara realidades laborales profundamente desiguales.</w:t>
       </w:r>
     </w:p>
     <w:p>
@@ -573,7 +573,7 @@
         <w:rPr>
           <w:rFonts w:ascii="Times New Roman" w:hAnsi="Times New Roman" w:cs="Times New Roman"/>
         </w:rPr>
-        <w:t xml:space="preserve"> obedece a razones científicas y de oportunidad: Lima es el mercado laboral más grande y diverso, donde la informalidad no puede atribuirse principalmente a la ruralidad sino a factores socioeconómicos individuales; el periodo corresponde a la fase de normalización pospandemia, en la que la informalidad se mantiene elevada e incluso repuntó en la capital; y, por primera vez de manera consolidada, se dispone de la información de la Encuesta Permanente de Empleo Nacional, que permite un análisis más preciso y actualizado. En síntesis, la informalidad laboral es un fenómeno estructural, global y persistente que en el departamento de Lima —pese a presentar las tasas relativas más bajas del país— afecta a la mayoría de los trabajadores y al mayor volumen absoluto de población ocupada del territorio nacional, asociado de manera robusta al nivel de ingresos, el nivel educativo y las características demográficas. Comprender la magnitud y la dirección del efecto de estos factores en el contexto limeño de 2024-2025 resulta indispensable para orientar políticas públicas eficaces, lo que conduce a la formulación del problema de investigación.</w:t>
+        <w:t xml:space="preserve"> obedece a razones científicas y de oportunidad: Lima es el mercado laboral más grande y diverso, donde la informalidad no puede atribuirse principalmente a la ruralidad sino a factores socioeconómicos individuales; el periodo corresponde a la fase de normalización pospandemia, en la que la informalidad se mantiene elevada e incluso repuntó en la capital; y, por primera vez de manera consolidada, se dispone de la información de la Encuesta Permanente de Empleo Nacional, que permite un análisis más preciso y actualizado. En particular, la disponibilidad de microdatos individuales habilita la estimación de modelos de elección discreta —como los modelos logit y probit— que cuantifican el efecto marginal de cada factor socioeconómico sobre la probabilidad de informalidad, controlando por las demás características del trabajador. En síntesis, la informalidad laboral es un fenómeno estructural, global y persistente que en el departamento de Lima —pese a presentar las tasas relativas más bajas del país— afecta a la mayoría de los trabajadores y al mayor volumen absoluto de población ocupada del territorio nacional, asociado de manera robusta al nivel de ingresos, el nivel educativo y las características demográficas. Comprender la magnitud y la dirección del efecto de estos factores en el contexto limeño de 2024-2025 resulta indispensable para orientar políticas públicas eficaces, lo que conduce a la formulación del problema de investigación.</w:t>
       </w:r>
     </w:p>
     <w:p>
@@ -1040,7 +1040,7 @@
       </w:r>
     </w:p>
     <w:sectPr>
-      <w:pgSz w:w="12240" w:h="15840"/>
+      <w:pgSz w:w="11906" w:h="16838"/>
       <w:pgMar w:top="1440" w:right="1440" w:bottom="1440" w:left="1440" w:header="720" w:footer="720" w:gutter="0"/>
       <w:cols w:space="720"/>
       <w:docGrid w:linePitch="360"/>

</xml_diff>